<commit_message>
Part 02: docker compose
</commit_message>
<xml_diff>
--- a/Doc1.docx
+++ b/Doc1.docx
@@ -1,6 +1,6 @@
 
 <file path=word/document.xml><?xml version="1.0" encoding="utf-8"?>
-<w:document xmlns:wpc="http://schemas.microsoft.com/office/word/2010/wordprocessingCanvas" xmlns:mc="http://schemas.openxmlformats.org/markup-compatibility/2006" xmlns:o="urn:schemas-microsoft-com:office:office" xmlns:r="http://schemas.openxmlformats.org/officeDocument/2006/relationships" xmlns:m="http://schemas.openxmlformats.org/officeDocument/2006/math" xmlns:v="urn:schemas-microsoft-com:vml" xmlns:wp14="http://schemas.microsoft.com/office/word/2010/wordprocessingDrawing" xmlns:wp="http://schemas.openxmlformats.org/drawingml/2006/wordprocessingDrawing" xmlns:w10="urn:schemas-microsoft-com:office:word" xmlns:w="http://schemas.openxmlformats.org/wordprocessingml/2006/main" xmlns:w14="http://schemas.microsoft.com/office/word/2010/wordml" xmlns:w15="http://schemas.microsoft.com/office/word/2012/wordml" xmlns:wpg="http://schemas.microsoft.com/office/word/2010/wordprocessingGroup" xmlns:wpi="http://schemas.microsoft.com/office/word/2010/wordprocessingInk" xmlns:wne="http://schemas.microsoft.com/office/word/2006/wordml" xmlns:wps="http://schemas.microsoft.com/office/word/2010/wordprocessingShape" mc:Ignorable="w14 w15 wp14">
+<w:document xmlns:wpc="http://schemas.microsoft.com/office/word/2010/wordprocessingCanvas" xmlns:cx="http://schemas.microsoft.com/office/drawing/2014/chartex" xmlns:cx1="http://schemas.microsoft.com/office/drawing/2015/9/8/chartex" xmlns:cx2="http://schemas.microsoft.com/office/drawing/2015/10/21/chartex" xmlns:cx3="http://schemas.microsoft.com/office/drawing/2016/5/9/chartex" xmlns:cx4="http://schemas.microsoft.com/office/drawing/2016/5/10/chartex" xmlns:cx5="http://schemas.microsoft.com/office/drawing/2016/5/11/chartex" xmlns:cx6="http://schemas.microsoft.com/office/drawing/2016/5/12/chartex" xmlns:cx7="http://schemas.microsoft.com/office/drawing/2016/5/13/chartex" xmlns:cx8="http://schemas.microsoft.com/office/drawing/2016/5/14/chartex" xmlns:mc="http://schemas.openxmlformats.org/markup-compatibility/2006" xmlns:aink="http://schemas.microsoft.com/office/drawing/2016/ink" xmlns:am3d="http://schemas.microsoft.com/office/drawing/2017/model3d" xmlns:o="urn:schemas-microsoft-com:office:office" xmlns:oel="http://schemas.microsoft.com/office/2019/extlst" xmlns:r="http://schemas.openxmlformats.org/officeDocument/2006/relationships" xmlns:m="http://schemas.openxmlformats.org/officeDocument/2006/math" xmlns:v="urn:schemas-microsoft-com:vml" xmlns:wp14="http://schemas.microsoft.com/office/word/2010/wordprocessingDrawing" xmlns:wp="http://schemas.openxmlformats.org/drawingml/2006/wordprocessingDrawing" xmlns:w10="urn:schemas-microsoft-com:office:word" xmlns:w="http://schemas.openxmlformats.org/wordprocessingml/2006/main" xmlns:w14="http://schemas.microsoft.com/office/word/2010/wordml" xmlns:w15="http://schemas.microsoft.com/office/word/2012/wordml" xmlns:w16cex="http://schemas.microsoft.com/office/word/2018/wordml/cex" xmlns:w16cid="http://schemas.microsoft.com/office/word/2016/wordml/cid" xmlns:w16="http://schemas.microsoft.com/office/word/2018/wordml" xmlns:w16du="http://schemas.microsoft.com/office/word/2023/wordml/word16du" xmlns:w16sdtdh="http://schemas.microsoft.com/office/word/2020/wordml/sdtdatahash" xmlns:w16sdtfl="http://schemas.microsoft.com/office/word/2024/wordml/sdtformatlock" xmlns:w16se="http://schemas.microsoft.com/office/word/2015/wordml/symex" xmlns:wpg="http://schemas.microsoft.com/office/word/2010/wordprocessingGroup" xmlns:wpi="http://schemas.microsoft.com/office/word/2010/wordprocessingInk" xmlns:wne="http://schemas.microsoft.com/office/word/2006/wordml" xmlns:wps="http://schemas.microsoft.com/office/word/2010/wordprocessingShape" mc:Ignorable="w14 w15 w16se w16cid w16 w16cex w16sdtdh w16sdtfl w16du wp14">
   <w:body>
     <w:p>
       <w:r>
@@ -105,13 +105,8 @@
     <w:p>
       <w:r>
         <w:lastRenderedPageBreak/>
-        <w:t>Truy cap localhost</w:t>
-      </w:r>
-      <w:proofErr w:type="gramStart"/>
-      <w:r>
-        <w:t>:8080</w:t>
-      </w:r>
-      <w:proofErr w:type="gramEnd"/>
+        <w:t>Truy cap localhost:8080</w:t>
+      </w:r>
     </w:p>
     <w:p>
       <w:r>
@@ -211,7 +206,7 @@
           <w:noProof/>
         </w:rPr>
         <w:drawing>
-          <wp:anchor distT="0" distB="0" distL="114300" distR="114300" simplePos="0" relativeHeight="251658240" behindDoc="0" locked="0" layoutInCell="1" allowOverlap="1">
+          <wp:anchor distT="0" distB="0" distL="114300" distR="114300" simplePos="0" relativeHeight="251658240" behindDoc="0" locked="0" layoutInCell="1" allowOverlap="1" wp14:anchorId="194107F5" wp14:editId="4F1DB82B">
             <wp:simplePos x="914400" y="914400"/>
             <wp:positionH relativeFrom="column">
               <wp:align>left</wp:align>
@@ -265,18 +260,1517 @@
       </w:r>
     </w:p>
     <w:p/>
+    <w:p>
+      <w:r>
+        <w:t>Bai 03</w:t>
+      </w:r>
+    </w:p>
+    <w:p>
+      <w:r>
+        <w:t>Docker-compose.yml</w:t>
+      </w:r>
+    </w:p>
+    <w:p>
+      <w:r>
+        <w:rPr>
+          <w:noProof/>
+        </w:rPr>
+        <w:drawing>
+          <wp:inline distT="0" distB="0" distL="0" distR="0" wp14:anchorId="15A59C83" wp14:editId="7697FD7E">
+            <wp:extent cx="5943600" cy="3199130"/>
+            <wp:effectExtent l="0" t="0" r="0" b="1270"/>
+            <wp:docPr id="814726872" name="Picture 1"/>
+            <wp:cNvGraphicFramePr>
+              <a:graphicFrameLocks xmlns:a="http://schemas.openxmlformats.org/drawingml/2006/main" noChangeAspect="1"/>
+            </wp:cNvGraphicFramePr>
+            <a:graphic xmlns:a="http://schemas.openxmlformats.org/drawingml/2006/main">
+              <a:graphicData uri="http://schemas.openxmlformats.org/drawingml/2006/picture">
+                <pic:pic xmlns:pic="http://schemas.openxmlformats.org/drawingml/2006/picture">
+                  <pic:nvPicPr>
+                    <pic:cNvPr id="814726872" name=""/>
+                    <pic:cNvPicPr/>
+                  </pic:nvPicPr>
+                  <pic:blipFill>
+                    <a:blip r:embed="rId9"/>
+                    <a:stretch>
+                      <a:fillRect/>
+                    </a:stretch>
+                  </pic:blipFill>
+                  <pic:spPr>
+                    <a:xfrm>
+                      <a:off x="0" y="0"/>
+                      <a:ext cx="5943600" cy="3199130"/>
+                    </a:xfrm>
+                    <a:prstGeom prst="rect">
+                      <a:avLst/>
+                    </a:prstGeom>
+                  </pic:spPr>
+                </pic:pic>
+              </a:graphicData>
+            </a:graphic>
+          </wp:inline>
+        </w:drawing>
+      </w:r>
+    </w:p>
     <w:p/>
     <w:p>
-      <w:pPr>
-        <w:tabs>
-          <w:tab w:val="left" w:pos="6150"/>
-        </w:tabs>
-      </w:pPr>
-      <w:r>
-        <w:tab/>
-      </w:r>
-      <w:bookmarkStart w:id="0" w:name="_GoBack"/>
-      <w:bookmarkEnd w:id="0"/>
+      <w:r>
+        <w:rPr>
+          <w:noProof/>
+        </w:rPr>
+        <w:drawing>
+          <wp:inline distT="0" distB="0" distL="0" distR="0" wp14:anchorId="7DA55F85" wp14:editId="540FCE9D">
+            <wp:extent cx="5943600" cy="814705"/>
+            <wp:effectExtent l="0" t="0" r="0" b="4445"/>
+            <wp:docPr id="1403479043" name="Picture 1"/>
+            <wp:cNvGraphicFramePr>
+              <a:graphicFrameLocks xmlns:a="http://schemas.openxmlformats.org/drawingml/2006/main" noChangeAspect="1"/>
+            </wp:cNvGraphicFramePr>
+            <a:graphic xmlns:a="http://schemas.openxmlformats.org/drawingml/2006/main">
+              <a:graphicData uri="http://schemas.openxmlformats.org/drawingml/2006/picture">
+                <pic:pic xmlns:pic="http://schemas.openxmlformats.org/drawingml/2006/picture">
+                  <pic:nvPicPr>
+                    <pic:cNvPr id="1403479043" name=""/>
+                    <pic:cNvPicPr/>
+                  </pic:nvPicPr>
+                  <pic:blipFill>
+                    <a:blip r:embed="rId10"/>
+                    <a:stretch>
+                      <a:fillRect/>
+                    </a:stretch>
+                  </pic:blipFill>
+                  <pic:spPr>
+                    <a:xfrm>
+                      <a:off x="0" y="0"/>
+                      <a:ext cx="5943600" cy="814705"/>
+                    </a:xfrm>
+                    <a:prstGeom prst="rect">
+                      <a:avLst/>
+                    </a:prstGeom>
+                  </pic:spPr>
+                </pic:pic>
+              </a:graphicData>
+            </a:graphic>
+          </wp:inline>
+        </w:drawing>
+      </w:r>
+    </w:p>
+    <w:p>
+      <w:pPr>
+        <w:tabs>
+          <w:tab w:val="left" w:pos="6150"/>
+        </w:tabs>
+      </w:pPr>
+    </w:p>
+    <w:p>
+      <w:pPr>
+        <w:tabs>
+          <w:tab w:val="left" w:pos="6150"/>
+        </w:tabs>
+      </w:pPr>
+      <w:r>
+        <w:rPr>
+          <w:noProof/>
+        </w:rPr>
+        <w:drawing>
+          <wp:inline distT="0" distB="0" distL="0" distR="0" wp14:anchorId="533403E7" wp14:editId="48E8DBE0">
+            <wp:extent cx="5943600" cy="3196590"/>
+            <wp:effectExtent l="0" t="0" r="0" b="3810"/>
+            <wp:docPr id="536962497" name="Picture 1"/>
+            <wp:cNvGraphicFramePr>
+              <a:graphicFrameLocks xmlns:a="http://schemas.openxmlformats.org/drawingml/2006/main" noChangeAspect="1"/>
+            </wp:cNvGraphicFramePr>
+            <a:graphic xmlns:a="http://schemas.openxmlformats.org/drawingml/2006/main">
+              <a:graphicData uri="http://schemas.openxmlformats.org/drawingml/2006/picture">
+                <pic:pic xmlns:pic="http://schemas.openxmlformats.org/drawingml/2006/picture">
+                  <pic:nvPicPr>
+                    <pic:cNvPr id="536962497" name=""/>
+                    <pic:cNvPicPr/>
+                  </pic:nvPicPr>
+                  <pic:blipFill>
+                    <a:blip r:embed="rId11"/>
+                    <a:stretch>
+                      <a:fillRect/>
+                    </a:stretch>
+                  </pic:blipFill>
+                  <pic:spPr>
+                    <a:xfrm>
+                      <a:off x="0" y="0"/>
+                      <a:ext cx="5943600" cy="3196590"/>
+                    </a:xfrm>
+                    <a:prstGeom prst="rect">
+                      <a:avLst/>
+                    </a:prstGeom>
+                  </pic:spPr>
+                </pic:pic>
+              </a:graphicData>
+            </a:graphic>
+          </wp:inline>
+        </w:drawing>
+      </w:r>
+    </w:p>
+    <w:p>
+      <w:pPr>
+        <w:tabs>
+          <w:tab w:val="left" w:pos="6150"/>
+        </w:tabs>
+      </w:pPr>
+      <w:r>
+        <w:rPr>
+          <w:noProof/>
+        </w:rPr>
+        <w:drawing>
+          <wp:inline distT="0" distB="0" distL="0" distR="0" wp14:anchorId="5E06B682" wp14:editId="36064C1A">
+            <wp:extent cx="5943600" cy="3343275"/>
+            <wp:effectExtent l="0" t="0" r="0" b="9525"/>
+            <wp:docPr id="343822096" name="Picture 1"/>
+            <wp:cNvGraphicFramePr>
+              <a:graphicFrameLocks xmlns:a="http://schemas.openxmlformats.org/drawingml/2006/main" noChangeAspect="1"/>
+            </wp:cNvGraphicFramePr>
+            <a:graphic xmlns:a="http://schemas.openxmlformats.org/drawingml/2006/main">
+              <a:graphicData uri="http://schemas.openxmlformats.org/drawingml/2006/picture">
+                <pic:pic xmlns:pic="http://schemas.openxmlformats.org/drawingml/2006/picture">
+                  <pic:nvPicPr>
+                    <pic:cNvPr id="343822096" name=""/>
+                    <pic:cNvPicPr/>
+                  </pic:nvPicPr>
+                  <pic:blipFill>
+                    <a:blip r:embed="rId12"/>
+                    <a:stretch>
+                      <a:fillRect/>
+                    </a:stretch>
+                  </pic:blipFill>
+                  <pic:spPr>
+                    <a:xfrm>
+                      <a:off x="0" y="0"/>
+                      <a:ext cx="5943600" cy="3343275"/>
+                    </a:xfrm>
+                    <a:prstGeom prst="rect">
+                      <a:avLst/>
+                    </a:prstGeom>
+                  </pic:spPr>
+                </pic:pic>
+              </a:graphicData>
+            </a:graphic>
+          </wp:inline>
+        </w:drawing>
+      </w:r>
+    </w:p>
+    <w:p>
+      <w:pPr>
+        <w:tabs>
+          <w:tab w:val="left" w:pos="6150"/>
+        </w:tabs>
+      </w:pPr>
+      <w:r>
+        <w:lastRenderedPageBreak/>
+        <w:t>Bai 04</w:t>
+      </w:r>
+    </w:p>
+    <w:p>
+      <w:pPr>
+        <w:tabs>
+          <w:tab w:val="left" w:pos="6150"/>
+        </w:tabs>
+      </w:pPr>
+      <w:r>
+        <w:t>init</w:t>
+      </w:r>
+    </w:p>
+    <w:p>
+      <w:pPr>
+        <w:tabs>
+          <w:tab w:val="left" w:pos="6150"/>
+        </w:tabs>
+      </w:pPr>
+      <w:r>
+        <w:rPr>
+          <w:noProof/>
+        </w:rPr>
+        <w:drawing>
+          <wp:inline distT="0" distB="0" distL="0" distR="0" wp14:anchorId="473593A3" wp14:editId="26133228">
+            <wp:extent cx="5943600" cy="3096260"/>
+            <wp:effectExtent l="0" t="0" r="0" b="8890"/>
+            <wp:docPr id="244164622" name="Picture 1"/>
+            <wp:cNvGraphicFramePr>
+              <a:graphicFrameLocks xmlns:a="http://schemas.openxmlformats.org/drawingml/2006/main" noChangeAspect="1"/>
+            </wp:cNvGraphicFramePr>
+            <a:graphic xmlns:a="http://schemas.openxmlformats.org/drawingml/2006/main">
+              <a:graphicData uri="http://schemas.openxmlformats.org/drawingml/2006/picture">
+                <pic:pic xmlns:pic="http://schemas.openxmlformats.org/drawingml/2006/picture">
+                  <pic:nvPicPr>
+                    <pic:cNvPr id="244164622" name=""/>
+                    <pic:cNvPicPr/>
+                  </pic:nvPicPr>
+                  <pic:blipFill>
+                    <a:blip r:embed="rId13"/>
+                    <a:stretch>
+                      <a:fillRect/>
+                    </a:stretch>
+                  </pic:blipFill>
+                  <pic:spPr>
+                    <a:xfrm>
+                      <a:off x="0" y="0"/>
+                      <a:ext cx="5943600" cy="3096260"/>
+                    </a:xfrm>
+                    <a:prstGeom prst="rect">
+                      <a:avLst/>
+                    </a:prstGeom>
+                  </pic:spPr>
+                </pic:pic>
+              </a:graphicData>
+            </a:graphic>
+          </wp:inline>
+        </w:drawing>
+      </w:r>
+    </w:p>
+    <w:p>
+      <w:pPr>
+        <w:tabs>
+          <w:tab w:val="left" w:pos="6150"/>
+        </w:tabs>
+      </w:pPr>
+      <w:r>
+        <w:rPr>
+          <w:noProof/>
+        </w:rPr>
+        <w:drawing>
+          <wp:inline distT="0" distB="0" distL="0" distR="0" wp14:anchorId="320ACE1F" wp14:editId="6509B664">
+            <wp:extent cx="5943600" cy="1242060"/>
+            <wp:effectExtent l="0" t="0" r="0" b="0"/>
+            <wp:docPr id="1949042103" name="Picture 1"/>
+            <wp:cNvGraphicFramePr>
+              <a:graphicFrameLocks xmlns:a="http://schemas.openxmlformats.org/drawingml/2006/main" noChangeAspect="1"/>
+            </wp:cNvGraphicFramePr>
+            <a:graphic xmlns:a="http://schemas.openxmlformats.org/drawingml/2006/main">
+              <a:graphicData uri="http://schemas.openxmlformats.org/drawingml/2006/picture">
+                <pic:pic xmlns:pic="http://schemas.openxmlformats.org/drawingml/2006/picture">
+                  <pic:nvPicPr>
+                    <pic:cNvPr id="1949042103" name=""/>
+                    <pic:cNvPicPr/>
+                  </pic:nvPicPr>
+                  <pic:blipFill>
+                    <a:blip r:embed="rId14"/>
+                    <a:stretch>
+                      <a:fillRect/>
+                    </a:stretch>
+                  </pic:blipFill>
+                  <pic:spPr>
+                    <a:xfrm>
+                      <a:off x="0" y="0"/>
+                      <a:ext cx="5943600" cy="1242060"/>
+                    </a:xfrm>
+                    <a:prstGeom prst="rect">
+                      <a:avLst/>
+                    </a:prstGeom>
+                  </pic:spPr>
+                </pic:pic>
+              </a:graphicData>
+            </a:graphic>
+          </wp:inline>
+        </w:drawing>
+      </w:r>
+    </w:p>
+    <w:p>
+      <w:pPr>
+        <w:tabs>
+          <w:tab w:val="left" w:pos="6150"/>
+        </w:tabs>
+      </w:pPr>
+      <w:r>
+        <w:rPr>
+          <w:noProof/>
+        </w:rPr>
+        <w:drawing>
+          <wp:inline distT="0" distB="0" distL="0" distR="0" wp14:anchorId="5B4EE098" wp14:editId="1E6CDF1E">
+            <wp:extent cx="5943600" cy="2313940"/>
+            <wp:effectExtent l="0" t="0" r="0" b="0"/>
+            <wp:docPr id="1414132989" name="Picture 1"/>
+            <wp:cNvGraphicFramePr>
+              <a:graphicFrameLocks xmlns:a="http://schemas.openxmlformats.org/drawingml/2006/main" noChangeAspect="1"/>
+            </wp:cNvGraphicFramePr>
+            <a:graphic xmlns:a="http://schemas.openxmlformats.org/drawingml/2006/main">
+              <a:graphicData uri="http://schemas.openxmlformats.org/drawingml/2006/picture">
+                <pic:pic xmlns:pic="http://schemas.openxmlformats.org/drawingml/2006/picture">
+                  <pic:nvPicPr>
+                    <pic:cNvPr id="1414132989" name=""/>
+                    <pic:cNvPicPr/>
+                  </pic:nvPicPr>
+                  <pic:blipFill>
+                    <a:blip r:embed="rId15"/>
+                    <a:stretch>
+                      <a:fillRect/>
+                    </a:stretch>
+                  </pic:blipFill>
+                  <pic:spPr>
+                    <a:xfrm>
+                      <a:off x="0" y="0"/>
+                      <a:ext cx="5943600" cy="2313940"/>
+                    </a:xfrm>
+                    <a:prstGeom prst="rect">
+                      <a:avLst/>
+                    </a:prstGeom>
+                  </pic:spPr>
+                </pic:pic>
+              </a:graphicData>
+            </a:graphic>
+          </wp:inline>
+        </w:drawing>
+      </w:r>
+    </w:p>
+    <w:p>
+      <w:pPr>
+        <w:tabs>
+          <w:tab w:val="left" w:pos="6150"/>
+        </w:tabs>
+      </w:pPr>
+      <w:r>
+        <w:rPr>
+          <w:noProof/>
+        </w:rPr>
+        <w:lastRenderedPageBreak/>
+        <w:drawing>
+          <wp:inline distT="0" distB="0" distL="0" distR="0" wp14:anchorId="1F36B34D" wp14:editId="1656A66A">
+            <wp:extent cx="5943600" cy="2943860"/>
+            <wp:effectExtent l="0" t="0" r="0" b="8890"/>
+            <wp:docPr id="2061746158" name="Picture 1"/>
+            <wp:cNvGraphicFramePr>
+              <a:graphicFrameLocks xmlns:a="http://schemas.openxmlformats.org/drawingml/2006/main" noChangeAspect="1"/>
+            </wp:cNvGraphicFramePr>
+            <a:graphic xmlns:a="http://schemas.openxmlformats.org/drawingml/2006/main">
+              <a:graphicData uri="http://schemas.openxmlformats.org/drawingml/2006/picture">
+                <pic:pic xmlns:pic="http://schemas.openxmlformats.org/drawingml/2006/picture">
+                  <pic:nvPicPr>
+                    <pic:cNvPr id="2061746158" name=""/>
+                    <pic:cNvPicPr/>
+                  </pic:nvPicPr>
+                  <pic:blipFill>
+                    <a:blip r:embed="rId16"/>
+                    <a:stretch>
+                      <a:fillRect/>
+                    </a:stretch>
+                  </pic:blipFill>
+                  <pic:spPr>
+                    <a:xfrm>
+                      <a:off x="0" y="0"/>
+                      <a:ext cx="5943600" cy="2943860"/>
+                    </a:xfrm>
+                    <a:prstGeom prst="rect">
+                      <a:avLst/>
+                    </a:prstGeom>
+                  </pic:spPr>
+                </pic:pic>
+              </a:graphicData>
+            </a:graphic>
+          </wp:inline>
+        </w:drawing>
+      </w:r>
+    </w:p>
+    <w:p>
+      <w:pPr>
+        <w:tabs>
+          <w:tab w:val="left" w:pos="6150"/>
+        </w:tabs>
+      </w:pPr>
+    </w:p>
+    <w:p>
+      <w:pPr>
+        <w:tabs>
+          <w:tab w:val="left" w:pos="6150"/>
+        </w:tabs>
+      </w:pPr>
+      <w:r>
+        <w:rPr>
+          <w:noProof/>
+        </w:rPr>
+        <w:drawing>
+          <wp:inline distT="0" distB="0" distL="0" distR="0" wp14:anchorId="7B657B79" wp14:editId="17E627A4">
+            <wp:extent cx="5943600" cy="2112645"/>
+            <wp:effectExtent l="0" t="0" r="0" b="1905"/>
+            <wp:docPr id="2006714353" name="Picture 1"/>
+            <wp:cNvGraphicFramePr>
+              <a:graphicFrameLocks xmlns:a="http://schemas.openxmlformats.org/drawingml/2006/main" noChangeAspect="1"/>
+            </wp:cNvGraphicFramePr>
+            <a:graphic xmlns:a="http://schemas.openxmlformats.org/drawingml/2006/main">
+              <a:graphicData uri="http://schemas.openxmlformats.org/drawingml/2006/picture">
+                <pic:pic xmlns:pic="http://schemas.openxmlformats.org/drawingml/2006/picture">
+                  <pic:nvPicPr>
+                    <pic:cNvPr id="2006714353" name=""/>
+                    <pic:cNvPicPr/>
+                  </pic:nvPicPr>
+                  <pic:blipFill>
+                    <a:blip r:embed="rId17"/>
+                    <a:stretch>
+                      <a:fillRect/>
+                    </a:stretch>
+                  </pic:blipFill>
+                  <pic:spPr>
+                    <a:xfrm>
+                      <a:off x="0" y="0"/>
+                      <a:ext cx="5943600" cy="2112645"/>
+                    </a:xfrm>
+                    <a:prstGeom prst="rect">
+                      <a:avLst/>
+                    </a:prstGeom>
+                  </pic:spPr>
+                </pic:pic>
+              </a:graphicData>
+            </a:graphic>
+          </wp:inline>
+        </w:drawing>
+      </w:r>
+    </w:p>
+    <w:p>
+      <w:pPr>
+        <w:tabs>
+          <w:tab w:val="left" w:pos="6150"/>
+        </w:tabs>
+      </w:pPr>
+      <w:r>
+        <w:rPr>
+          <w:noProof/>
+        </w:rPr>
+        <w:drawing>
+          <wp:inline distT="0" distB="0" distL="0" distR="0" wp14:anchorId="70BF7358" wp14:editId="602D0FD8">
+            <wp:extent cx="5943600" cy="2132330"/>
+            <wp:effectExtent l="0" t="0" r="0" b="1270"/>
+            <wp:docPr id="2128034388" name="Picture 1"/>
+            <wp:cNvGraphicFramePr>
+              <a:graphicFrameLocks xmlns:a="http://schemas.openxmlformats.org/drawingml/2006/main" noChangeAspect="1"/>
+            </wp:cNvGraphicFramePr>
+            <a:graphic xmlns:a="http://schemas.openxmlformats.org/drawingml/2006/main">
+              <a:graphicData uri="http://schemas.openxmlformats.org/drawingml/2006/picture">
+                <pic:pic xmlns:pic="http://schemas.openxmlformats.org/drawingml/2006/picture">
+                  <pic:nvPicPr>
+                    <pic:cNvPr id="2128034388" name=""/>
+                    <pic:cNvPicPr/>
+                  </pic:nvPicPr>
+                  <pic:blipFill>
+                    <a:blip r:embed="rId18"/>
+                    <a:stretch>
+                      <a:fillRect/>
+                    </a:stretch>
+                  </pic:blipFill>
+                  <pic:spPr>
+                    <a:xfrm>
+                      <a:off x="0" y="0"/>
+                      <a:ext cx="5943600" cy="2132330"/>
+                    </a:xfrm>
+                    <a:prstGeom prst="rect">
+                      <a:avLst/>
+                    </a:prstGeom>
+                  </pic:spPr>
+                </pic:pic>
+              </a:graphicData>
+            </a:graphic>
+          </wp:inline>
+        </w:drawing>
+      </w:r>
+    </w:p>
+    <w:p>
+      <w:pPr>
+        <w:tabs>
+          <w:tab w:val="left" w:pos="6150"/>
+        </w:tabs>
+      </w:pPr>
+      <w:r>
+        <w:rPr>
+          <w:noProof/>
+        </w:rPr>
+        <w:lastRenderedPageBreak/>
+        <w:drawing>
+          <wp:inline distT="0" distB="0" distL="0" distR="0" wp14:anchorId="2A39112E" wp14:editId="6A54D598">
+            <wp:extent cx="5457825" cy="3362325"/>
+            <wp:effectExtent l="0" t="0" r="9525" b="9525"/>
+            <wp:docPr id="360035330" name="Picture 1"/>
+            <wp:cNvGraphicFramePr>
+              <a:graphicFrameLocks xmlns:a="http://schemas.openxmlformats.org/drawingml/2006/main" noChangeAspect="1"/>
+            </wp:cNvGraphicFramePr>
+            <a:graphic xmlns:a="http://schemas.openxmlformats.org/drawingml/2006/main">
+              <a:graphicData uri="http://schemas.openxmlformats.org/drawingml/2006/picture">
+                <pic:pic xmlns:pic="http://schemas.openxmlformats.org/drawingml/2006/picture">
+                  <pic:nvPicPr>
+                    <pic:cNvPr id="360035330" name=""/>
+                    <pic:cNvPicPr/>
+                  </pic:nvPicPr>
+                  <pic:blipFill>
+                    <a:blip r:embed="rId19"/>
+                    <a:stretch>
+                      <a:fillRect/>
+                    </a:stretch>
+                  </pic:blipFill>
+                  <pic:spPr>
+                    <a:xfrm>
+                      <a:off x="0" y="0"/>
+                      <a:ext cx="5457825" cy="3362325"/>
+                    </a:xfrm>
+                    <a:prstGeom prst="rect">
+                      <a:avLst/>
+                    </a:prstGeom>
+                  </pic:spPr>
+                </pic:pic>
+              </a:graphicData>
+            </a:graphic>
+          </wp:inline>
+        </w:drawing>
+      </w:r>
+    </w:p>
+    <w:p>
+      <w:pPr>
+        <w:tabs>
+          <w:tab w:val="left" w:pos="6150"/>
+        </w:tabs>
+      </w:pPr>
+      <w:r>
+        <w:t>Bai 5</w:t>
+      </w:r>
+    </w:p>
+    <w:p>
+      <w:pPr>
+        <w:tabs>
+          <w:tab w:val="left" w:pos="6150"/>
+        </w:tabs>
+      </w:pPr>
+    </w:p>
+    <w:p>
+      <w:pPr>
+        <w:tabs>
+          <w:tab w:val="left" w:pos="6150"/>
+        </w:tabs>
+      </w:pPr>
+      <w:r>
+        <w:rPr>
+          <w:noProof/>
+        </w:rPr>
+        <w:drawing>
+          <wp:inline distT="0" distB="0" distL="0" distR="0" wp14:anchorId="5CC784F0" wp14:editId="44CF8298">
+            <wp:extent cx="5943600" cy="3025775"/>
+            <wp:effectExtent l="0" t="0" r="0" b="3175"/>
+            <wp:docPr id="1885318108" name="Picture 1"/>
+            <wp:cNvGraphicFramePr>
+              <a:graphicFrameLocks xmlns:a="http://schemas.openxmlformats.org/drawingml/2006/main" noChangeAspect="1"/>
+            </wp:cNvGraphicFramePr>
+            <a:graphic xmlns:a="http://schemas.openxmlformats.org/drawingml/2006/main">
+              <a:graphicData uri="http://schemas.openxmlformats.org/drawingml/2006/picture">
+                <pic:pic xmlns:pic="http://schemas.openxmlformats.org/drawingml/2006/picture">
+                  <pic:nvPicPr>
+                    <pic:cNvPr id="1885318108" name=""/>
+                    <pic:cNvPicPr/>
+                  </pic:nvPicPr>
+                  <pic:blipFill>
+                    <a:blip r:embed="rId20"/>
+                    <a:stretch>
+                      <a:fillRect/>
+                    </a:stretch>
+                  </pic:blipFill>
+                  <pic:spPr>
+                    <a:xfrm>
+                      <a:off x="0" y="0"/>
+                      <a:ext cx="5943600" cy="3025775"/>
+                    </a:xfrm>
+                    <a:prstGeom prst="rect">
+                      <a:avLst/>
+                    </a:prstGeom>
+                  </pic:spPr>
+                </pic:pic>
+              </a:graphicData>
+            </a:graphic>
+          </wp:inline>
+        </w:drawing>
+      </w:r>
+    </w:p>
+    <w:p>
+      <w:pPr>
+        <w:tabs>
+          <w:tab w:val="left" w:pos="6150"/>
+        </w:tabs>
+      </w:pPr>
+    </w:p>
+    <w:p>
+      <w:pPr>
+        <w:tabs>
+          <w:tab w:val="left" w:pos="6150"/>
+        </w:tabs>
+      </w:pPr>
+      <w:r>
+        <w:rPr>
+          <w:noProof/>
+        </w:rPr>
+        <w:lastRenderedPageBreak/>
+        <w:drawing>
+          <wp:inline distT="0" distB="0" distL="0" distR="0" wp14:anchorId="58E0EB7F" wp14:editId="5ECDB600">
+            <wp:extent cx="5943600" cy="2662555"/>
+            <wp:effectExtent l="0" t="0" r="0" b="4445"/>
+            <wp:docPr id="619511213" name="Picture 1"/>
+            <wp:cNvGraphicFramePr>
+              <a:graphicFrameLocks xmlns:a="http://schemas.openxmlformats.org/drawingml/2006/main" noChangeAspect="1"/>
+            </wp:cNvGraphicFramePr>
+            <a:graphic xmlns:a="http://schemas.openxmlformats.org/drawingml/2006/main">
+              <a:graphicData uri="http://schemas.openxmlformats.org/drawingml/2006/picture">
+                <pic:pic xmlns:pic="http://schemas.openxmlformats.org/drawingml/2006/picture">
+                  <pic:nvPicPr>
+                    <pic:cNvPr id="619511213" name=""/>
+                    <pic:cNvPicPr/>
+                  </pic:nvPicPr>
+                  <pic:blipFill>
+                    <a:blip r:embed="rId21"/>
+                    <a:stretch>
+                      <a:fillRect/>
+                    </a:stretch>
+                  </pic:blipFill>
+                  <pic:spPr>
+                    <a:xfrm>
+                      <a:off x="0" y="0"/>
+                      <a:ext cx="5943600" cy="2662555"/>
+                    </a:xfrm>
+                    <a:prstGeom prst="rect">
+                      <a:avLst/>
+                    </a:prstGeom>
+                  </pic:spPr>
+                </pic:pic>
+              </a:graphicData>
+            </a:graphic>
+          </wp:inline>
+        </w:drawing>
+      </w:r>
+    </w:p>
+    <w:p>
+      <w:pPr>
+        <w:tabs>
+          <w:tab w:val="left" w:pos="6150"/>
+        </w:tabs>
+      </w:pPr>
+    </w:p>
+    <w:p>
+      <w:pPr>
+        <w:tabs>
+          <w:tab w:val="left" w:pos="6150"/>
+        </w:tabs>
+      </w:pPr>
+      <w:r>
+        <w:rPr>
+          <w:noProof/>
+        </w:rPr>
+        <w:drawing>
+          <wp:inline distT="0" distB="0" distL="0" distR="0" wp14:anchorId="0172F1CB" wp14:editId="4CD2DF24">
+            <wp:extent cx="5943600" cy="713740"/>
+            <wp:effectExtent l="0" t="0" r="0" b="0"/>
+            <wp:docPr id="326292105" name="Picture 1"/>
+            <wp:cNvGraphicFramePr>
+              <a:graphicFrameLocks xmlns:a="http://schemas.openxmlformats.org/drawingml/2006/main" noChangeAspect="1"/>
+            </wp:cNvGraphicFramePr>
+            <a:graphic xmlns:a="http://schemas.openxmlformats.org/drawingml/2006/main">
+              <a:graphicData uri="http://schemas.openxmlformats.org/drawingml/2006/picture">
+                <pic:pic xmlns:pic="http://schemas.openxmlformats.org/drawingml/2006/picture">
+                  <pic:nvPicPr>
+                    <pic:cNvPr id="326292105" name=""/>
+                    <pic:cNvPicPr/>
+                  </pic:nvPicPr>
+                  <pic:blipFill>
+                    <a:blip r:embed="rId22"/>
+                    <a:stretch>
+                      <a:fillRect/>
+                    </a:stretch>
+                  </pic:blipFill>
+                  <pic:spPr>
+                    <a:xfrm>
+                      <a:off x="0" y="0"/>
+                      <a:ext cx="5943600" cy="713740"/>
+                    </a:xfrm>
+                    <a:prstGeom prst="rect">
+                      <a:avLst/>
+                    </a:prstGeom>
+                  </pic:spPr>
+                </pic:pic>
+              </a:graphicData>
+            </a:graphic>
+          </wp:inline>
+        </w:drawing>
+      </w:r>
+    </w:p>
+    <w:p>
+      <w:pPr>
+        <w:tabs>
+          <w:tab w:val="left" w:pos="6150"/>
+        </w:tabs>
+      </w:pPr>
+    </w:p>
+    <w:p>
+      <w:r>
+        <w:br w:type="page"/>
+      </w:r>
+    </w:p>
+    <w:p>
+      <w:pPr>
+        <w:tabs>
+          <w:tab w:val="left" w:pos="6150"/>
+        </w:tabs>
+      </w:pPr>
+      <w:r>
+        <w:lastRenderedPageBreak/>
+        <w:t>Bai 07</w:t>
+      </w:r>
+    </w:p>
+    <w:p>
+      <w:pPr>
+        <w:tabs>
+          <w:tab w:val="left" w:pos="6150"/>
+        </w:tabs>
+      </w:pPr>
+      <w:r>
+        <w:rPr>
+          <w:noProof/>
+        </w:rPr>
+        <w:drawing>
+          <wp:inline distT="0" distB="0" distL="0" distR="0" wp14:anchorId="04B2585E" wp14:editId="4CCB5523">
+            <wp:extent cx="5943600" cy="4118610"/>
+            <wp:effectExtent l="0" t="0" r="0" b="0"/>
+            <wp:docPr id="683664609" name="Picture 1"/>
+            <wp:cNvGraphicFramePr>
+              <a:graphicFrameLocks xmlns:a="http://schemas.openxmlformats.org/drawingml/2006/main" noChangeAspect="1"/>
+            </wp:cNvGraphicFramePr>
+            <a:graphic xmlns:a="http://schemas.openxmlformats.org/drawingml/2006/main">
+              <a:graphicData uri="http://schemas.openxmlformats.org/drawingml/2006/picture">
+                <pic:pic xmlns:pic="http://schemas.openxmlformats.org/drawingml/2006/picture">
+                  <pic:nvPicPr>
+                    <pic:cNvPr id="683664609" name=""/>
+                    <pic:cNvPicPr/>
+                  </pic:nvPicPr>
+                  <pic:blipFill>
+                    <a:blip r:embed="rId23"/>
+                    <a:stretch>
+                      <a:fillRect/>
+                    </a:stretch>
+                  </pic:blipFill>
+                  <pic:spPr>
+                    <a:xfrm>
+                      <a:off x="0" y="0"/>
+                      <a:ext cx="5943600" cy="4118610"/>
+                    </a:xfrm>
+                    <a:prstGeom prst="rect">
+                      <a:avLst/>
+                    </a:prstGeom>
+                  </pic:spPr>
+                </pic:pic>
+              </a:graphicData>
+            </a:graphic>
+          </wp:inline>
+        </w:drawing>
+      </w:r>
+    </w:p>
+    <w:p>
+      <w:pPr>
+        <w:tabs>
+          <w:tab w:val="left" w:pos="6150"/>
+        </w:tabs>
+      </w:pPr>
+      <w:r>
+        <w:rPr>
+          <w:noProof/>
+        </w:rPr>
+        <w:drawing>
+          <wp:inline distT="0" distB="0" distL="0" distR="0" wp14:anchorId="6BF9C1AB" wp14:editId="3E67B7FA">
+            <wp:extent cx="5943600" cy="2964815"/>
+            <wp:effectExtent l="0" t="0" r="0" b="6985"/>
+            <wp:docPr id="367268780" name="Picture 1"/>
+            <wp:cNvGraphicFramePr>
+              <a:graphicFrameLocks xmlns:a="http://schemas.openxmlformats.org/drawingml/2006/main" noChangeAspect="1"/>
+            </wp:cNvGraphicFramePr>
+            <a:graphic xmlns:a="http://schemas.openxmlformats.org/drawingml/2006/main">
+              <a:graphicData uri="http://schemas.openxmlformats.org/drawingml/2006/picture">
+                <pic:pic xmlns:pic="http://schemas.openxmlformats.org/drawingml/2006/picture">
+                  <pic:nvPicPr>
+                    <pic:cNvPr id="367268780" name=""/>
+                    <pic:cNvPicPr/>
+                  </pic:nvPicPr>
+                  <pic:blipFill>
+                    <a:blip r:embed="rId24"/>
+                    <a:stretch>
+                      <a:fillRect/>
+                    </a:stretch>
+                  </pic:blipFill>
+                  <pic:spPr>
+                    <a:xfrm>
+                      <a:off x="0" y="0"/>
+                      <a:ext cx="5943600" cy="2964815"/>
+                    </a:xfrm>
+                    <a:prstGeom prst="rect">
+                      <a:avLst/>
+                    </a:prstGeom>
+                  </pic:spPr>
+                </pic:pic>
+              </a:graphicData>
+            </a:graphic>
+          </wp:inline>
+        </w:drawing>
+      </w:r>
+    </w:p>
+    <w:p>
+      <w:pPr>
+        <w:tabs>
+          <w:tab w:val="left" w:pos="6150"/>
+        </w:tabs>
+      </w:pPr>
+      <w:r>
+        <w:rPr>
+          <w:noProof/>
+        </w:rPr>
+        <w:lastRenderedPageBreak/>
+        <w:drawing>
+          <wp:inline distT="0" distB="0" distL="0" distR="0" wp14:anchorId="1848EDBF" wp14:editId="11EA6F5C">
+            <wp:extent cx="5943600" cy="1991360"/>
+            <wp:effectExtent l="0" t="0" r="0" b="8890"/>
+            <wp:docPr id="2008506234" name="Picture 1"/>
+            <wp:cNvGraphicFramePr>
+              <a:graphicFrameLocks xmlns:a="http://schemas.openxmlformats.org/drawingml/2006/main" noChangeAspect="1"/>
+            </wp:cNvGraphicFramePr>
+            <a:graphic xmlns:a="http://schemas.openxmlformats.org/drawingml/2006/main">
+              <a:graphicData uri="http://schemas.openxmlformats.org/drawingml/2006/picture">
+                <pic:pic xmlns:pic="http://schemas.openxmlformats.org/drawingml/2006/picture">
+                  <pic:nvPicPr>
+                    <pic:cNvPr id="2008506234" name=""/>
+                    <pic:cNvPicPr/>
+                  </pic:nvPicPr>
+                  <pic:blipFill>
+                    <a:blip r:embed="rId25"/>
+                    <a:stretch>
+                      <a:fillRect/>
+                    </a:stretch>
+                  </pic:blipFill>
+                  <pic:spPr>
+                    <a:xfrm>
+                      <a:off x="0" y="0"/>
+                      <a:ext cx="5943600" cy="1991360"/>
+                    </a:xfrm>
+                    <a:prstGeom prst="rect">
+                      <a:avLst/>
+                    </a:prstGeom>
+                  </pic:spPr>
+                </pic:pic>
+              </a:graphicData>
+            </a:graphic>
+          </wp:inline>
+        </w:drawing>
+      </w:r>
+    </w:p>
+    <w:p>
+      <w:pPr>
+        <w:tabs>
+          <w:tab w:val="left" w:pos="6150"/>
+        </w:tabs>
+      </w:pPr>
+      <w:r>
+        <w:rPr>
+          <w:noProof/>
+        </w:rPr>
+        <w:drawing>
+          <wp:inline distT="0" distB="0" distL="0" distR="0" wp14:anchorId="5510E4CD" wp14:editId="10A502F9">
+            <wp:extent cx="5943600" cy="3343275"/>
+            <wp:effectExtent l="0" t="0" r="0" b="9525"/>
+            <wp:docPr id="1300633971" name="Picture 1"/>
+            <wp:cNvGraphicFramePr>
+              <a:graphicFrameLocks xmlns:a="http://schemas.openxmlformats.org/drawingml/2006/main" noChangeAspect="1"/>
+            </wp:cNvGraphicFramePr>
+            <a:graphic xmlns:a="http://schemas.openxmlformats.org/drawingml/2006/main">
+              <a:graphicData uri="http://schemas.openxmlformats.org/drawingml/2006/picture">
+                <pic:pic xmlns:pic="http://schemas.openxmlformats.org/drawingml/2006/picture">
+                  <pic:nvPicPr>
+                    <pic:cNvPr id="1300633971" name=""/>
+                    <pic:cNvPicPr/>
+                  </pic:nvPicPr>
+                  <pic:blipFill>
+                    <a:blip r:embed="rId26"/>
+                    <a:stretch>
+                      <a:fillRect/>
+                    </a:stretch>
+                  </pic:blipFill>
+                  <pic:spPr>
+                    <a:xfrm>
+                      <a:off x="0" y="0"/>
+                      <a:ext cx="5943600" cy="3343275"/>
+                    </a:xfrm>
+                    <a:prstGeom prst="rect">
+                      <a:avLst/>
+                    </a:prstGeom>
+                  </pic:spPr>
+                </pic:pic>
+              </a:graphicData>
+            </a:graphic>
+          </wp:inline>
+        </w:drawing>
+      </w:r>
+    </w:p>
+    <w:p>
+      <w:pPr>
+        <w:tabs>
+          <w:tab w:val="left" w:pos="6150"/>
+        </w:tabs>
+      </w:pPr>
+    </w:p>
+    <w:p>
+      <w:r>
+        <w:br w:type="page"/>
+      </w:r>
+    </w:p>
+    <w:p>
+      <w:pPr>
+        <w:tabs>
+          <w:tab w:val="left" w:pos="6150"/>
+        </w:tabs>
+      </w:pPr>
+      <w:r>
+        <w:lastRenderedPageBreak/>
+        <w:t>Bai 08</w:t>
+      </w:r>
+    </w:p>
+    <w:p>
+      <w:pPr>
+        <w:tabs>
+          <w:tab w:val="left" w:pos="6150"/>
+        </w:tabs>
+      </w:pPr>
+    </w:p>
+    <w:p>
+      <w:pPr>
+        <w:tabs>
+          <w:tab w:val="left" w:pos="6150"/>
+        </w:tabs>
+      </w:pPr>
+      <w:r>
+        <w:rPr>
+          <w:noProof/>
+        </w:rPr>
+        <w:drawing>
+          <wp:inline distT="0" distB="0" distL="0" distR="0" wp14:anchorId="1351CD12" wp14:editId="4B88E188">
+            <wp:extent cx="5943600" cy="2590800"/>
+            <wp:effectExtent l="0" t="0" r="0" b="0"/>
+            <wp:docPr id="739222373" name="Picture 1"/>
+            <wp:cNvGraphicFramePr>
+              <a:graphicFrameLocks xmlns:a="http://schemas.openxmlformats.org/drawingml/2006/main" noChangeAspect="1"/>
+            </wp:cNvGraphicFramePr>
+            <a:graphic xmlns:a="http://schemas.openxmlformats.org/drawingml/2006/main">
+              <a:graphicData uri="http://schemas.openxmlformats.org/drawingml/2006/picture">
+                <pic:pic xmlns:pic="http://schemas.openxmlformats.org/drawingml/2006/picture">
+                  <pic:nvPicPr>
+                    <pic:cNvPr id="739222373" name=""/>
+                    <pic:cNvPicPr/>
+                  </pic:nvPicPr>
+                  <pic:blipFill>
+                    <a:blip r:embed="rId27"/>
+                    <a:stretch>
+                      <a:fillRect/>
+                    </a:stretch>
+                  </pic:blipFill>
+                  <pic:spPr>
+                    <a:xfrm>
+                      <a:off x="0" y="0"/>
+                      <a:ext cx="5943600" cy="2590800"/>
+                    </a:xfrm>
+                    <a:prstGeom prst="rect">
+                      <a:avLst/>
+                    </a:prstGeom>
+                  </pic:spPr>
+                </pic:pic>
+              </a:graphicData>
+            </a:graphic>
+          </wp:inline>
+        </w:drawing>
+      </w:r>
+    </w:p>
+    <w:p>
+      <w:pPr>
+        <w:tabs>
+          <w:tab w:val="left" w:pos="6150"/>
+        </w:tabs>
+      </w:pPr>
+      <w:r>
+        <w:rPr>
+          <w:noProof/>
+        </w:rPr>
+        <w:lastRenderedPageBreak/>
+        <w:drawing>
+          <wp:inline distT="0" distB="0" distL="0" distR="0" wp14:anchorId="1D1B21B5" wp14:editId="34E8CBA9">
+            <wp:extent cx="5648325" cy="6677025"/>
+            <wp:effectExtent l="0" t="0" r="9525" b="9525"/>
+            <wp:docPr id="1383328213" name="Picture 1"/>
+            <wp:cNvGraphicFramePr>
+              <a:graphicFrameLocks xmlns:a="http://schemas.openxmlformats.org/drawingml/2006/main" noChangeAspect="1"/>
+            </wp:cNvGraphicFramePr>
+            <a:graphic xmlns:a="http://schemas.openxmlformats.org/drawingml/2006/main">
+              <a:graphicData uri="http://schemas.openxmlformats.org/drawingml/2006/picture">
+                <pic:pic xmlns:pic="http://schemas.openxmlformats.org/drawingml/2006/picture">
+                  <pic:nvPicPr>
+                    <pic:cNvPr id="1383328213" name=""/>
+                    <pic:cNvPicPr/>
+                  </pic:nvPicPr>
+                  <pic:blipFill>
+                    <a:blip r:embed="rId28"/>
+                    <a:stretch>
+                      <a:fillRect/>
+                    </a:stretch>
+                  </pic:blipFill>
+                  <pic:spPr>
+                    <a:xfrm>
+                      <a:off x="0" y="0"/>
+                      <a:ext cx="5648325" cy="6677025"/>
+                    </a:xfrm>
+                    <a:prstGeom prst="rect">
+                      <a:avLst/>
+                    </a:prstGeom>
+                  </pic:spPr>
+                </pic:pic>
+              </a:graphicData>
+            </a:graphic>
+          </wp:inline>
+        </w:drawing>
+      </w:r>
+    </w:p>
+    <w:p>
+      <w:pPr>
+        <w:tabs>
+          <w:tab w:val="left" w:pos="6150"/>
+        </w:tabs>
+      </w:pPr>
+    </w:p>
+    <w:p>
+      <w:pPr>
+        <w:tabs>
+          <w:tab w:val="left" w:pos="6150"/>
+        </w:tabs>
+      </w:pPr>
+      <w:r>
+        <w:rPr>
+          <w:noProof/>
+        </w:rPr>
+        <w:lastRenderedPageBreak/>
+        <w:drawing>
+          <wp:inline distT="0" distB="0" distL="0" distR="0" wp14:anchorId="4F0E3307" wp14:editId="6EC863DD">
+            <wp:extent cx="4714875" cy="3286125"/>
+            <wp:effectExtent l="0" t="0" r="9525" b="9525"/>
+            <wp:docPr id="2088105953" name="Picture 1"/>
+            <wp:cNvGraphicFramePr>
+              <a:graphicFrameLocks xmlns:a="http://schemas.openxmlformats.org/drawingml/2006/main" noChangeAspect="1"/>
+            </wp:cNvGraphicFramePr>
+            <a:graphic xmlns:a="http://schemas.openxmlformats.org/drawingml/2006/main">
+              <a:graphicData uri="http://schemas.openxmlformats.org/drawingml/2006/picture">
+                <pic:pic xmlns:pic="http://schemas.openxmlformats.org/drawingml/2006/picture">
+                  <pic:nvPicPr>
+                    <pic:cNvPr id="2088105953" name=""/>
+                    <pic:cNvPicPr/>
+                  </pic:nvPicPr>
+                  <pic:blipFill>
+                    <a:blip r:embed="rId29"/>
+                    <a:stretch>
+                      <a:fillRect/>
+                    </a:stretch>
+                  </pic:blipFill>
+                  <pic:spPr>
+                    <a:xfrm>
+                      <a:off x="0" y="0"/>
+                      <a:ext cx="4714875" cy="3286125"/>
+                    </a:xfrm>
+                    <a:prstGeom prst="rect">
+                      <a:avLst/>
+                    </a:prstGeom>
+                  </pic:spPr>
+                </pic:pic>
+              </a:graphicData>
+            </a:graphic>
+          </wp:inline>
+        </w:drawing>
+      </w:r>
+    </w:p>
+    <w:p>
+      <w:pPr>
+        <w:tabs>
+          <w:tab w:val="left" w:pos="6150"/>
+        </w:tabs>
+      </w:pPr>
+    </w:p>
+    <w:p>
+      <w:pPr>
+        <w:tabs>
+          <w:tab w:val="left" w:pos="6150"/>
+        </w:tabs>
+      </w:pPr>
+      <w:r>
+        <w:rPr>
+          <w:noProof/>
+        </w:rPr>
+        <w:lastRenderedPageBreak/>
+        <w:drawing>
+          <wp:inline distT="0" distB="0" distL="0" distR="0" wp14:anchorId="28185D03" wp14:editId="1FCA6BBF">
+            <wp:extent cx="5943600" cy="4973320"/>
+            <wp:effectExtent l="0" t="0" r="0" b="0"/>
+            <wp:docPr id="1521298653" name="Picture 1"/>
+            <wp:cNvGraphicFramePr>
+              <a:graphicFrameLocks xmlns:a="http://schemas.openxmlformats.org/drawingml/2006/main" noChangeAspect="1"/>
+            </wp:cNvGraphicFramePr>
+            <a:graphic xmlns:a="http://schemas.openxmlformats.org/drawingml/2006/main">
+              <a:graphicData uri="http://schemas.openxmlformats.org/drawingml/2006/picture">
+                <pic:pic xmlns:pic="http://schemas.openxmlformats.org/drawingml/2006/picture">
+                  <pic:nvPicPr>
+                    <pic:cNvPr id="1521298653" name=""/>
+                    <pic:cNvPicPr/>
+                  </pic:nvPicPr>
+                  <pic:blipFill>
+                    <a:blip r:embed="rId30"/>
+                    <a:stretch>
+                      <a:fillRect/>
+                    </a:stretch>
+                  </pic:blipFill>
+                  <pic:spPr>
+                    <a:xfrm>
+                      <a:off x="0" y="0"/>
+                      <a:ext cx="5943600" cy="4973320"/>
+                    </a:xfrm>
+                    <a:prstGeom prst="rect">
+                      <a:avLst/>
+                    </a:prstGeom>
+                  </pic:spPr>
+                </pic:pic>
+              </a:graphicData>
+            </a:graphic>
+          </wp:inline>
+        </w:drawing>
+      </w:r>
+    </w:p>
+    <w:p>
+      <w:pPr>
+        <w:tabs>
+          <w:tab w:val="left" w:pos="6150"/>
+        </w:tabs>
+      </w:pPr>
+    </w:p>
+    <w:p>
+      <w:pPr>
+        <w:tabs>
+          <w:tab w:val="left" w:pos="6150"/>
+        </w:tabs>
+      </w:pPr>
+      <w:r>
+        <w:rPr>
+          <w:noProof/>
+        </w:rPr>
+        <w:lastRenderedPageBreak/>
+        <w:drawing>
+          <wp:inline distT="0" distB="0" distL="0" distR="0" wp14:anchorId="20C47C09" wp14:editId="093CE1EC">
+            <wp:extent cx="5943600" cy="3017520"/>
+            <wp:effectExtent l="0" t="0" r="0" b="0"/>
+            <wp:docPr id="1883792579" name="Picture 1"/>
+            <wp:cNvGraphicFramePr>
+              <a:graphicFrameLocks xmlns:a="http://schemas.openxmlformats.org/drawingml/2006/main" noChangeAspect="1"/>
+            </wp:cNvGraphicFramePr>
+            <a:graphic xmlns:a="http://schemas.openxmlformats.org/drawingml/2006/main">
+              <a:graphicData uri="http://schemas.openxmlformats.org/drawingml/2006/picture">
+                <pic:pic xmlns:pic="http://schemas.openxmlformats.org/drawingml/2006/picture">
+                  <pic:nvPicPr>
+                    <pic:cNvPr id="1883792579" name=""/>
+                    <pic:cNvPicPr/>
+                  </pic:nvPicPr>
+                  <pic:blipFill>
+                    <a:blip r:embed="rId31"/>
+                    <a:stretch>
+                      <a:fillRect/>
+                    </a:stretch>
+                  </pic:blipFill>
+                  <pic:spPr>
+                    <a:xfrm>
+                      <a:off x="0" y="0"/>
+                      <a:ext cx="5943600" cy="3017520"/>
+                    </a:xfrm>
+                    <a:prstGeom prst="rect">
+                      <a:avLst/>
+                    </a:prstGeom>
+                  </pic:spPr>
+                </pic:pic>
+              </a:graphicData>
+            </a:graphic>
+          </wp:inline>
+        </w:drawing>
+      </w:r>
+    </w:p>
+    <w:p>
+      <w:pPr>
+        <w:tabs>
+          <w:tab w:val="left" w:pos="6150"/>
+        </w:tabs>
+      </w:pPr>
+    </w:p>
+    <w:p>
+      <w:pPr>
+        <w:tabs>
+          <w:tab w:val="left" w:pos="6150"/>
+        </w:tabs>
+      </w:pPr>
+      <w:r>
+        <w:t>Bai 09</w:t>
+      </w:r>
+    </w:p>
+    <w:p>
+      <w:pPr>
+        <w:tabs>
+          <w:tab w:val="left" w:pos="6150"/>
+        </w:tabs>
+      </w:pPr>
+      <w:r>
+        <w:rPr>
+          <w:noProof/>
+        </w:rPr>
+        <w:drawing>
+          <wp:inline distT="0" distB="0" distL="0" distR="0" wp14:anchorId="7EEA3BA1" wp14:editId="7AFE990E">
+            <wp:extent cx="4486275" cy="3228975"/>
+            <wp:effectExtent l="0" t="0" r="9525" b="9525"/>
+            <wp:docPr id="1036287900" name="Picture 1"/>
+            <wp:cNvGraphicFramePr>
+              <a:graphicFrameLocks xmlns:a="http://schemas.openxmlformats.org/drawingml/2006/main" noChangeAspect="1"/>
+            </wp:cNvGraphicFramePr>
+            <a:graphic xmlns:a="http://schemas.openxmlformats.org/drawingml/2006/main">
+              <a:graphicData uri="http://schemas.openxmlformats.org/drawingml/2006/picture">
+                <pic:pic xmlns:pic="http://schemas.openxmlformats.org/drawingml/2006/picture">
+                  <pic:nvPicPr>
+                    <pic:cNvPr id="1036287900" name=""/>
+                    <pic:cNvPicPr/>
+                  </pic:nvPicPr>
+                  <pic:blipFill>
+                    <a:blip r:embed="rId32"/>
+                    <a:stretch>
+                      <a:fillRect/>
+                    </a:stretch>
+                  </pic:blipFill>
+                  <pic:spPr>
+                    <a:xfrm>
+                      <a:off x="0" y="0"/>
+                      <a:ext cx="4486275" cy="3228975"/>
+                    </a:xfrm>
+                    <a:prstGeom prst="rect">
+                      <a:avLst/>
+                    </a:prstGeom>
+                  </pic:spPr>
+                </pic:pic>
+              </a:graphicData>
+            </a:graphic>
+          </wp:inline>
+        </w:drawing>
+      </w:r>
+    </w:p>
+    <w:p>
+      <w:pPr>
+        <w:tabs>
+          <w:tab w:val="left" w:pos="6150"/>
+        </w:tabs>
+      </w:pPr>
+    </w:p>
+    <w:p>
+      <w:pPr>
+        <w:tabs>
+          <w:tab w:val="left" w:pos="6150"/>
+        </w:tabs>
+      </w:pPr>
+      <w:r>
+        <w:rPr>
+          <w:noProof/>
+        </w:rPr>
+        <w:lastRenderedPageBreak/>
+        <w:drawing>
+          <wp:inline distT="0" distB="0" distL="0" distR="0" wp14:anchorId="774D9C94" wp14:editId="777CD41F">
+            <wp:extent cx="3857625" cy="1657350"/>
+            <wp:effectExtent l="0" t="0" r="9525" b="0"/>
+            <wp:docPr id="963393763" name="Picture 1"/>
+            <wp:cNvGraphicFramePr>
+              <a:graphicFrameLocks xmlns:a="http://schemas.openxmlformats.org/drawingml/2006/main" noChangeAspect="1"/>
+            </wp:cNvGraphicFramePr>
+            <a:graphic xmlns:a="http://schemas.openxmlformats.org/drawingml/2006/main">
+              <a:graphicData uri="http://schemas.openxmlformats.org/drawingml/2006/picture">
+                <pic:pic xmlns:pic="http://schemas.openxmlformats.org/drawingml/2006/picture">
+                  <pic:nvPicPr>
+                    <pic:cNvPr id="963393763" name=""/>
+                    <pic:cNvPicPr/>
+                  </pic:nvPicPr>
+                  <pic:blipFill>
+                    <a:blip r:embed="rId33"/>
+                    <a:stretch>
+                      <a:fillRect/>
+                    </a:stretch>
+                  </pic:blipFill>
+                  <pic:spPr>
+                    <a:xfrm>
+                      <a:off x="0" y="0"/>
+                      <a:ext cx="3857625" cy="1657350"/>
+                    </a:xfrm>
+                    <a:prstGeom prst="rect">
+                      <a:avLst/>
+                    </a:prstGeom>
+                  </pic:spPr>
+                </pic:pic>
+              </a:graphicData>
+            </a:graphic>
+          </wp:inline>
+        </w:drawing>
+      </w:r>
+    </w:p>
+    <w:p>
+      <w:pPr>
+        <w:tabs>
+          <w:tab w:val="left" w:pos="6150"/>
+        </w:tabs>
+      </w:pPr>
+    </w:p>
+    <w:p>
+      <w:pPr>
+        <w:tabs>
+          <w:tab w:val="left" w:pos="6150"/>
+        </w:tabs>
+      </w:pPr>
+      <w:r>
+        <w:rPr>
+          <w:noProof/>
+        </w:rPr>
+        <w:drawing>
+          <wp:inline distT="0" distB="0" distL="0" distR="0" wp14:anchorId="03F664FD" wp14:editId="28E8794F">
+            <wp:extent cx="5943600" cy="3333750"/>
+            <wp:effectExtent l="0" t="0" r="0" b="0"/>
+            <wp:docPr id="1401451776" name="Picture 1"/>
+            <wp:cNvGraphicFramePr>
+              <a:graphicFrameLocks xmlns:a="http://schemas.openxmlformats.org/drawingml/2006/main" noChangeAspect="1"/>
+            </wp:cNvGraphicFramePr>
+            <a:graphic xmlns:a="http://schemas.openxmlformats.org/drawingml/2006/main">
+              <a:graphicData uri="http://schemas.openxmlformats.org/drawingml/2006/picture">
+                <pic:pic xmlns:pic="http://schemas.openxmlformats.org/drawingml/2006/picture">
+                  <pic:nvPicPr>
+                    <pic:cNvPr id="1401451776" name=""/>
+                    <pic:cNvPicPr/>
+                  </pic:nvPicPr>
+                  <pic:blipFill>
+                    <a:blip r:embed="rId34"/>
+                    <a:stretch>
+                      <a:fillRect/>
+                    </a:stretch>
+                  </pic:blipFill>
+                  <pic:spPr>
+                    <a:xfrm>
+                      <a:off x="0" y="0"/>
+                      <a:ext cx="5943600" cy="3333750"/>
+                    </a:xfrm>
+                    <a:prstGeom prst="rect">
+                      <a:avLst/>
+                    </a:prstGeom>
+                  </pic:spPr>
+                </pic:pic>
+              </a:graphicData>
+            </a:graphic>
+          </wp:inline>
+        </w:drawing>
+      </w:r>
+    </w:p>
+    <w:p>
+      <w:pPr>
+        <w:tabs>
+          <w:tab w:val="left" w:pos="6150"/>
+        </w:tabs>
+      </w:pPr>
+    </w:p>
+    <w:p>
+      <w:pPr>
+        <w:tabs>
+          <w:tab w:val="left" w:pos="6150"/>
+        </w:tabs>
+      </w:pPr>
+      <w:r>
+        <w:rPr>
+          <w:noProof/>
+        </w:rPr>
+        <w:lastRenderedPageBreak/>
+        <w:drawing>
+          <wp:inline distT="0" distB="0" distL="0" distR="0" wp14:anchorId="2E4C7964" wp14:editId="6629A2F6">
+            <wp:extent cx="5943600" cy="2853690"/>
+            <wp:effectExtent l="0" t="0" r="0" b="3810"/>
+            <wp:docPr id="1715237870" name="Picture 1"/>
+            <wp:cNvGraphicFramePr>
+              <a:graphicFrameLocks xmlns:a="http://schemas.openxmlformats.org/drawingml/2006/main" noChangeAspect="1"/>
+            </wp:cNvGraphicFramePr>
+            <a:graphic xmlns:a="http://schemas.openxmlformats.org/drawingml/2006/main">
+              <a:graphicData uri="http://schemas.openxmlformats.org/drawingml/2006/picture">
+                <pic:pic xmlns:pic="http://schemas.openxmlformats.org/drawingml/2006/picture">
+                  <pic:nvPicPr>
+                    <pic:cNvPr id="1715237870" name=""/>
+                    <pic:cNvPicPr/>
+                  </pic:nvPicPr>
+                  <pic:blipFill>
+                    <a:blip r:embed="rId35"/>
+                    <a:stretch>
+                      <a:fillRect/>
+                    </a:stretch>
+                  </pic:blipFill>
+                  <pic:spPr>
+                    <a:xfrm>
+                      <a:off x="0" y="0"/>
+                      <a:ext cx="5943600" cy="2853690"/>
+                    </a:xfrm>
+                    <a:prstGeom prst="rect">
+                      <a:avLst/>
+                    </a:prstGeom>
+                  </pic:spPr>
+                </pic:pic>
+              </a:graphicData>
+            </a:graphic>
+          </wp:inline>
+        </w:drawing>
+      </w:r>
+    </w:p>
+    <w:p>
+      <w:pPr>
+        <w:tabs>
+          <w:tab w:val="left" w:pos="6150"/>
+        </w:tabs>
+      </w:pPr>
+    </w:p>
+    <w:p>
+      <w:pPr>
+        <w:tabs>
+          <w:tab w:val="left" w:pos="6150"/>
+        </w:tabs>
+      </w:pPr>
+      <w:r>
+        <w:rPr>
+          <w:noProof/>
+        </w:rPr>
+        <w:drawing>
+          <wp:inline distT="0" distB="0" distL="0" distR="0" wp14:anchorId="17F14B5F" wp14:editId="1E84E5A2">
+            <wp:extent cx="5943600" cy="2579370"/>
+            <wp:effectExtent l="0" t="0" r="0" b="0"/>
+            <wp:docPr id="1383243154" name="Picture 1"/>
+            <wp:cNvGraphicFramePr>
+              <a:graphicFrameLocks xmlns:a="http://schemas.openxmlformats.org/drawingml/2006/main" noChangeAspect="1"/>
+            </wp:cNvGraphicFramePr>
+            <a:graphic xmlns:a="http://schemas.openxmlformats.org/drawingml/2006/main">
+              <a:graphicData uri="http://schemas.openxmlformats.org/drawingml/2006/picture">
+                <pic:pic xmlns:pic="http://schemas.openxmlformats.org/drawingml/2006/picture">
+                  <pic:nvPicPr>
+                    <pic:cNvPr id="1383243154" name=""/>
+                    <pic:cNvPicPr/>
+                  </pic:nvPicPr>
+                  <pic:blipFill>
+                    <a:blip r:embed="rId36"/>
+                    <a:stretch>
+                      <a:fillRect/>
+                    </a:stretch>
+                  </pic:blipFill>
+                  <pic:spPr>
+                    <a:xfrm>
+                      <a:off x="0" y="0"/>
+                      <a:ext cx="5943600" cy="2579370"/>
+                    </a:xfrm>
+                    <a:prstGeom prst="rect">
+                      <a:avLst/>
+                    </a:prstGeom>
+                  </pic:spPr>
+                </pic:pic>
+              </a:graphicData>
+            </a:graphic>
+          </wp:inline>
+        </w:drawing>
+      </w:r>
     </w:p>
     <w:sectPr>
       <w:pgSz w:w="12240" w:h="15840"/>
@@ -289,7 +1783,7 @@
 </file>
 
 <file path=word/styles.xml><?xml version="1.0" encoding="utf-8"?>
-<w:styles xmlns:mc="http://schemas.openxmlformats.org/markup-compatibility/2006" xmlns:r="http://schemas.openxmlformats.org/officeDocument/2006/relationships" xmlns:w="http://schemas.openxmlformats.org/wordprocessingml/2006/main" xmlns:w14="http://schemas.microsoft.com/office/word/2010/wordml" xmlns:w15="http://schemas.microsoft.com/office/word/2012/wordml" mc:Ignorable="w14 w15">
+<w:styles xmlns:mc="http://schemas.openxmlformats.org/markup-compatibility/2006" xmlns:r="http://schemas.openxmlformats.org/officeDocument/2006/relationships" xmlns:w="http://schemas.openxmlformats.org/wordprocessingml/2006/main" xmlns:w14="http://schemas.microsoft.com/office/word/2010/wordml" xmlns:w15="http://schemas.microsoft.com/office/word/2012/wordml" xmlns:w16cex="http://schemas.microsoft.com/office/word/2018/wordml/cex" xmlns:w16cid="http://schemas.microsoft.com/office/word/2016/wordml/cid" xmlns:w16="http://schemas.microsoft.com/office/word/2018/wordml" xmlns:w16du="http://schemas.microsoft.com/office/word/2023/wordml/word16du" xmlns:w16sdtdh="http://schemas.microsoft.com/office/word/2020/wordml/sdtdatahash" xmlns:w16sdtfl="http://schemas.microsoft.com/office/word/2024/wordml/sdtformatlock" xmlns:w16se="http://schemas.microsoft.com/office/word/2015/wordml/symex" mc:Ignorable="w14 w15 w16se w16cid w16 w16cex w16sdtdh w16sdtfl w16du">
   <w:docDefaults>
     <w:rPrDefault>
       <w:rPr>
@@ -305,7 +1799,7 @@
       </w:pPr>
     </w:pPrDefault>
   </w:docDefaults>
-  <w:latentStyles w:defLockedState="0" w:defUIPriority="99" w:defSemiHidden="0" w:defUnhideWhenUsed="0" w:defQFormat="0" w:count="371">
+  <w:latentStyles w:defLockedState="0" w:defUIPriority="99" w:defSemiHidden="0" w:defUnhideWhenUsed="0" w:defQFormat="0" w:count="376">
     <w:lsdException w:name="Normal" w:uiPriority="0" w:qFormat="1"/>
     <w:lsdException w:name="heading 1" w:uiPriority="9" w:qFormat="1"/>
     <w:lsdException w:name="heading 2" w:semiHidden="1" w:uiPriority="9" w:unhideWhenUsed="1" w:qFormat="1"/>
@@ -677,6 +2171,11 @@
     <w:lsdException w:name="List Table 5 Dark Accent 6" w:uiPriority="50"/>
     <w:lsdException w:name="List Table 6 Colorful Accent 6" w:uiPriority="51"/>
     <w:lsdException w:name="List Table 7 Colorful Accent 6" w:uiPriority="52"/>
+    <w:lsdException w:name="Mention" w:semiHidden="1" w:unhideWhenUsed="1"/>
+    <w:lsdException w:name="Smart Hyperlink" w:semiHidden="1" w:unhideWhenUsed="1"/>
+    <w:lsdException w:name="Hashtag" w:semiHidden="1" w:unhideWhenUsed="1"/>
+    <w:lsdException w:name="Unresolved Mention" w:semiHidden="1" w:unhideWhenUsed="1"/>
+    <w:lsdException w:name="Smart Link" w:semiHidden="1" w:unhideWhenUsed="1"/>
   </w:latentStyles>
   <w:style w:type="paragraph" w:default="1" w:styleId="Normal">
     <w:name w:val="Normal"/>

</xml_diff>